<commit_message>
v1.3.12: March 2026 ISM updates
</commit_message>
<xml_diff>
--- a/static/content/files/Blueprint Essential Eight Template.docx
+++ b/static/content/files/Blueprint Essential Eight Template.docx
@@ -49,7 +49,7 @@
         <w:br w:type="page"/>
       </w:r>
     </w:p>
-    <w:bookmarkStart w:id="20" w:name="X9e6329012a53849c82b1e0abc691b2d8f2aa138"/>
+    <w:bookmarkStart w:id="23" w:name="X9e6329012a53849c82b1e0abc691b2d8f2aa138"/>
     <w:p>
       <w:pPr>
         <w:pStyle w:val="Heading1"/>
@@ -668,8 +668,8 @@
         <w:br w:type="page"/>
       </w:r>
     </w:p>
-    <w:bookmarkEnd w:id="20"/>
-    <w:bookmarkStart w:id="40" w:name="Xce6894c1e1fb48d202d574978b9c4d3c98d8487"/>
+    <w:bookmarkEnd w:id="23"/>
+    <w:bookmarkStart w:id="43" w:name="Xce6894c1e1fb48d202d574978b9c4d3c98d8487"/>
     <w:p>
       <w:pPr>
         <w:pStyle w:val="Heading1"/>
@@ -818,7 +818,7 @@
             <w:r>
               <w:t xml:space="preserve"> </w:t>
             </w:r>
-            <w:hyperlink r:id="rId21">
+            <w:hyperlink r:id="rId24">
               <w:r>
                 <w:rPr>
                   <w:rStyle w:val="Hyperlink"/>
@@ -849,7 +849,7 @@
             <w:r>
               <w:t xml:space="preserve"> </w:t>
             </w:r>
-            <w:hyperlink r:id="rId22">
+            <w:hyperlink r:id="rId25">
               <w:r>
                 <w:rPr>
                   <w:rStyle w:val="Hyperlink"/>
@@ -895,7 +895,7 @@
         </w:tc>
       </w:tr>
     </w:tbl>
-    <w:bookmarkStart w:id="23" w:name="applicability"/>
+    <w:bookmarkStart w:id="26" w:name="applicability"/>
     <w:p>
       <w:pPr>
         <w:pStyle w:val="Heading2"/>
@@ -962,8 +962,8 @@
         <w:t xml:space="preserve">&lt;INSERT ADDITIONAL INFORMATION AS APPROPRIATE&gt;</w:t>
       </w:r>
     </w:p>
-    <w:bookmarkEnd w:id="23"/>
-    <w:bookmarkStart w:id="24" w:name="maturity-level"/>
+    <w:bookmarkEnd w:id="26"/>
+    <w:bookmarkStart w:id="27" w:name="maturity-level"/>
     <w:p>
       <w:pPr>
         <w:pStyle w:val="Heading2"/>
@@ -1104,8 +1104,8 @@
         </w:tc>
       </w:tr>
     </w:tbl>
-    <w:bookmarkEnd w:id="24"/>
-    <w:bookmarkStart w:id="39" w:name="implementation"/>
+    <w:bookmarkEnd w:id="27"/>
+    <w:bookmarkStart w:id="42" w:name="implementation"/>
     <w:p>
       <w:pPr>
         <w:pStyle w:val="Heading2"/>
@@ -1114,7 +1114,7 @@
         <w:t xml:space="preserve">Implementation</w:t>
       </w:r>
     </w:p>
-    <w:bookmarkStart w:id="25" w:name="asset-discovery"/>
+    <w:bookmarkStart w:id="28" w:name="asset-discovery"/>
     <w:p>
       <w:pPr>
         <w:pStyle w:val="Heading3"/>
@@ -1310,8 +1310,8 @@
         <w:t xml:space="preserve">&lt;INSERT ADDITIONAL INFORMATION AS APPROPRIATE&gt;</w:t>
       </w:r>
     </w:p>
-    <w:bookmarkEnd w:id="25"/>
-    <w:bookmarkStart w:id="29" w:name="vulnerability-scanning"/>
+    <w:bookmarkEnd w:id="28"/>
+    <w:bookmarkStart w:id="32" w:name="vulnerability-scanning"/>
     <w:p>
       <w:pPr>
         <w:pStyle w:val="Heading3"/>
@@ -1796,7 +1796,7 @@
         <w:t xml:space="preserve">basis.</w:t>
       </w:r>
     </w:p>
-    <w:bookmarkStart w:id="26" w:name="windows-endpoints"/>
+    <w:bookmarkStart w:id="29" w:name="windows-endpoints"/>
     <w:p>
       <w:pPr>
         <w:pStyle w:val="Heading4"/>
@@ -1860,8 +1860,8 @@
         <w:t xml:space="preserve">&lt;INSERT ADDITIONAL INFORMATION AS APPROPRIATE&gt;</w:t>
       </w:r>
     </w:p>
-    <w:bookmarkEnd w:id="26"/>
-    <w:bookmarkStart w:id="27" w:name="hybrid-servers"/>
+    <w:bookmarkEnd w:id="29"/>
+    <w:bookmarkStart w:id="30" w:name="hybrid-servers"/>
     <w:p>
       <w:pPr>
         <w:pStyle w:val="Heading4"/>
@@ -1925,8 +1925,8 @@
         <w:t xml:space="preserve">&lt;INSERT ADDITIONAL INFORMATION AS APPROPRIATE&gt;</w:t>
       </w:r>
     </w:p>
-    <w:bookmarkEnd w:id="27"/>
-    <w:bookmarkStart w:id="28" w:name="servers-for-online-services"/>
+    <w:bookmarkEnd w:id="30"/>
+    <w:bookmarkStart w:id="31" w:name="servers-for-online-services"/>
     <w:p>
       <w:pPr>
         <w:pStyle w:val="Heading4"/>
@@ -1978,9 +1978,9 @@
         <w:t xml:space="preserve">&lt;INSERT ADDITIONAL INFORMATION AS APPROPRIATE&gt;</w:t>
       </w:r>
     </w:p>
-    <w:bookmarkEnd w:id="28"/>
-    <w:bookmarkEnd w:id="29"/>
-    <w:bookmarkStart w:id="34" w:name="patching"/>
+    <w:bookmarkEnd w:id="31"/>
+    <w:bookmarkEnd w:id="32"/>
+    <w:bookmarkStart w:id="37" w:name="patching"/>
     <w:p>
       <w:pPr>
         <w:pStyle w:val="Heading3"/>
@@ -2677,7 +2677,7 @@
         </w:tc>
       </w:tr>
     </w:tbl>
-    <w:bookmarkStart w:id="31" w:name="windows-endpoints-1"/>
+    <w:bookmarkStart w:id="34" w:name="windows-endpoints-1"/>
     <w:p>
       <w:pPr>
         <w:pStyle w:val="Heading4"/>
@@ -2704,7 +2704,7 @@
       <w:r>
         <w:t xml:space="preserve"> </w:t>
       </w:r>
-      <w:hyperlink r:id="rId30">
+      <w:hyperlink r:id="rId33">
         <w:r>
           <w:rPr>
             <w:rStyle w:val="VerbatimChar"/>
@@ -2819,8 +2819,8 @@
         <w:t xml:space="preserve">&lt;INSERT ADDITIONAL INFORMATION AS APPROPRIATE&gt;</w:t>
       </w:r>
     </w:p>
-    <w:bookmarkEnd w:id="31"/>
-    <w:bookmarkStart w:id="32" w:name="hybrid-servers-1"/>
+    <w:bookmarkEnd w:id="34"/>
+    <w:bookmarkStart w:id="35" w:name="hybrid-servers-1"/>
     <w:p>
       <w:pPr>
         <w:pStyle w:val="Heading4"/>
@@ -2859,7 +2859,7 @@
       <w:r>
         <w:t xml:space="preserve"> </w:t>
       </w:r>
-      <w:hyperlink r:id="rId30">
+      <w:hyperlink r:id="rId33">
         <w:r>
           <w:rPr>
             <w:rStyle w:val="VerbatimChar"/>
@@ -2991,8 +2991,8 @@
         <w:t xml:space="preserve">&lt;INSERT ADDITIONAL INFORMATION AS APPROPRIATE&gt;</w:t>
       </w:r>
     </w:p>
-    <w:bookmarkEnd w:id="32"/>
-    <w:bookmarkStart w:id="33" w:name="servers-for-online-services-1"/>
+    <w:bookmarkEnd w:id="35"/>
+    <w:bookmarkStart w:id="36" w:name="servers-for-online-services-1"/>
     <w:p>
       <w:pPr>
         <w:pStyle w:val="Heading4"/>
@@ -3044,9 +3044,9 @@
         <w:t xml:space="preserve">&lt;INSERT ADDITIONAL INFORMATION AS APPROPRIATE&gt;</w:t>
       </w:r>
     </w:p>
-    <w:bookmarkEnd w:id="33"/>
-    <w:bookmarkEnd w:id="34"/>
-    <w:bookmarkStart w:id="38" w:name="removal-of-unsupported-applications"/>
+    <w:bookmarkEnd w:id="36"/>
+    <w:bookmarkEnd w:id="37"/>
+    <w:bookmarkStart w:id="41" w:name="removal-of-unsupported-applications"/>
     <w:p>
       <w:pPr>
         <w:pStyle w:val="Heading3"/>
@@ -3112,7 +3112,7 @@
         </w:tc>
       </w:tr>
     </w:tbl>
-    <w:bookmarkStart w:id="35" w:name="windows-endpoints-2"/>
+    <w:bookmarkStart w:id="38" w:name="windows-endpoints-2"/>
     <w:p>
       <w:pPr>
         <w:pStyle w:val="Heading4"/>
@@ -3131,7 +3131,7 @@
       <w:r>
         <w:t xml:space="preserve"> </w:t>
       </w:r>
-      <w:hyperlink r:id="rId30">
+      <w:hyperlink r:id="rId33">
         <w:r>
           <w:rPr>
             <w:rStyle w:val="VerbatimChar"/>
@@ -3196,8 +3196,8 @@
         <w:t xml:space="preserve">&lt;INSERT ADDITIONAL INFORMATION AS APPROPRIATE&gt;</w:t>
       </w:r>
     </w:p>
-    <w:bookmarkEnd w:id="35"/>
-    <w:bookmarkStart w:id="36" w:name="hybrid-servers-2"/>
+    <w:bookmarkEnd w:id="38"/>
+    <w:bookmarkStart w:id="39" w:name="hybrid-servers-2"/>
     <w:p>
       <w:pPr>
         <w:pStyle w:val="Heading4"/>
@@ -3216,7 +3216,7 @@
       <w:r>
         <w:t xml:space="preserve"> </w:t>
       </w:r>
-      <w:hyperlink r:id="rId30">
+      <w:hyperlink r:id="rId33">
         <w:r>
           <w:rPr>
             <w:rStyle w:val="VerbatimChar"/>
@@ -3281,8 +3281,8 @@
         <w:t xml:space="preserve">&lt;INSERT ADDITIONAL INFORMATION AS APPROPRIATE&gt;</w:t>
       </w:r>
     </w:p>
-    <w:bookmarkEnd w:id="36"/>
-    <w:bookmarkStart w:id="37" w:name="servers-for-online-services-2"/>
+    <w:bookmarkEnd w:id="39"/>
+    <w:bookmarkStart w:id="40" w:name="servers-for-online-services-2"/>
     <w:p>
       <w:pPr>
         <w:pStyle w:val="Heading4"/>
@@ -3339,11 +3339,11 @@
         <w:br w:type="page"/>
       </w:r>
     </w:p>
-    <w:bookmarkEnd w:id="37"/>
-    <w:bookmarkEnd w:id="38"/>
-    <w:bookmarkEnd w:id="39"/>
     <w:bookmarkEnd w:id="40"/>
-    <w:bookmarkStart w:id="54" w:name="X43679319daa5d35c40c103b5c17349314211272"/>
+    <w:bookmarkEnd w:id="41"/>
+    <w:bookmarkEnd w:id="42"/>
+    <w:bookmarkEnd w:id="43"/>
+    <w:bookmarkStart w:id="57" w:name="X43679319daa5d35c40c103b5c17349314211272"/>
     <w:p>
       <w:pPr>
         <w:pStyle w:val="Heading1"/>
@@ -3492,7 +3492,7 @@
             <w:r>
               <w:t xml:space="preserve"> </w:t>
             </w:r>
-            <w:hyperlink r:id="rId21">
+            <w:hyperlink r:id="rId24">
               <w:r>
                 <w:rPr>
                   <w:rStyle w:val="Hyperlink"/>
@@ -3523,7 +3523,7 @@
             <w:r>
               <w:t xml:space="preserve"> </w:t>
             </w:r>
-            <w:hyperlink r:id="rId22">
+            <w:hyperlink r:id="rId25">
               <w:r>
                 <w:rPr>
                   <w:rStyle w:val="Hyperlink"/>
@@ -3569,7 +3569,7 @@
         </w:tc>
       </w:tr>
     </w:tbl>
-    <w:bookmarkStart w:id="41" w:name="applicability-1"/>
+    <w:bookmarkStart w:id="44" w:name="applicability-1"/>
     <w:p>
       <w:pPr>
         <w:pStyle w:val="Heading2"/>
@@ -3636,8 +3636,8 @@
         <w:t xml:space="preserve">&lt;INSERT ADDITIONAL INFORMATION AS APPROPRIATE&gt;</w:t>
       </w:r>
     </w:p>
-    <w:bookmarkEnd w:id="41"/>
-    <w:bookmarkStart w:id="42" w:name="maturity-level-1"/>
+    <w:bookmarkEnd w:id="44"/>
+    <w:bookmarkStart w:id="45" w:name="maturity-level-1"/>
     <w:p>
       <w:pPr>
         <w:pStyle w:val="Heading2"/>
@@ -3778,8 +3778,8 @@
         </w:tc>
       </w:tr>
     </w:tbl>
-    <w:bookmarkEnd w:id="42"/>
-    <w:bookmarkStart w:id="53" w:name="implementation-1"/>
+    <w:bookmarkEnd w:id="45"/>
+    <w:bookmarkStart w:id="56" w:name="implementation-1"/>
     <w:p>
       <w:pPr>
         <w:pStyle w:val="Heading2"/>
@@ -3788,7 +3788,7 @@
         <w:t xml:space="preserve">Implementation</w:t>
       </w:r>
     </w:p>
-    <w:bookmarkStart w:id="43" w:name="asset-discovery-1"/>
+    <w:bookmarkStart w:id="46" w:name="asset-discovery-1"/>
     <w:p>
       <w:pPr>
         <w:pStyle w:val="Heading3"/>
@@ -3939,8 +3939,8 @@
         <w:t xml:space="preserve">&lt;INSERT ADDITIONAL INFORMATION AS APPROPRIATE&gt;</w:t>
       </w:r>
     </w:p>
-    <w:bookmarkEnd w:id="43"/>
-    <w:bookmarkStart w:id="46" w:name="vulnerability-scanning-1"/>
+    <w:bookmarkEnd w:id="46"/>
+    <w:bookmarkStart w:id="49" w:name="vulnerability-scanning-1"/>
     <w:p>
       <w:pPr>
         <w:pStyle w:val="Heading3"/>
@@ -4556,7 +4556,7 @@
         <w:t xml:space="preserve">basis.</w:t>
       </w:r>
     </w:p>
-    <w:bookmarkStart w:id="44" w:name="windows-endpoints-3"/>
+    <w:bookmarkStart w:id="47" w:name="windows-endpoints-3"/>
     <w:p>
       <w:pPr>
         <w:pStyle w:val="Heading4"/>
@@ -4620,8 +4620,8 @@
         <w:t xml:space="preserve">&lt;INSERT ADDITIONAL INFORMATION AS APPROPRIATE&gt;</w:t>
       </w:r>
     </w:p>
-    <w:bookmarkEnd w:id="44"/>
-    <w:bookmarkStart w:id="45" w:name="hybrid-servers-3"/>
+    <w:bookmarkEnd w:id="47"/>
+    <w:bookmarkStart w:id="48" w:name="hybrid-servers-3"/>
     <w:p>
       <w:pPr>
         <w:pStyle w:val="Heading4"/>
@@ -4755,9 +4755,9 @@
         <w:t xml:space="preserve">&lt;INSERT ADDITIONAL INFORMATION AS APPROPRIATE&gt;</w:t>
       </w:r>
     </w:p>
-    <w:bookmarkEnd w:id="45"/>
-    <w:bookmarkEnd w:id="46"/>
-    <w:bookmarkStart w:id="49" w:name="patching-1"/>
+    <w:bookmarkEnd w:id="48"/>
+    <w:bookmarkEnd w:id="49"/>
+    <w:bookmarkStart w:id="52" w:name="patching-1"/>
     <w:p>
       <w:pPr>
         <w:pStyle w:val="Heading3"/>
@@ -5681,7 +5681,7 @@
         </w:tc>
       </w:tr>
     </w:tbl>
-    <w:bookmarkStart w:id="47" w:name="windows-endpoints-4"/>
+    <w:bookmarkStart w:id="50" w:name="windows-endpoints-4"/>
     <w:p>
       <w:pPr>
         <w:pStyle w:val="Heading4"/>
@@ -5708,7 +5708,7 @@
       <w:r>
         <w:t xml:space="preserve"> </w:t>
       </w:r>
-      <w:hyperlink r:id="rId30">
+      <w:hyperlink r:id="rId33">
         <w:r>
           <w:rPr>
             <w:rStyle w:val="VerbatimChar"/>
@@ -5800,8 +5800,8 @@
         <w:t xml:space="preserve">&lt;INSERT ADDITIONAL INFORMATION AS APPROPRIATE&gt;</w:t>
       </w:r>
     </w:p>
-    <w:bookmarkEnd w:id="47"/>
-    <w:bookmarkStart w:id="48" w:name="hybrid-servers-4"/>
+    <w:bookmarkEnd w:id="50"/>
+    <w:bookmarkStart w:id="51" w:name="hybrid-servers-4"/>
     <w:p>
       <w:pPr>
         <w:pStyle w:val="Heading4"/>
@@ -5852,7 +5852,7 @@
       <w:r>
         <w:t xml:space="preserve"> </w:t>
       </w:r>
-      <w:hyperlink r:id="rId30">
+      <w:hyperlink r:id="rId33">
         <w:r>
           <w:rPr>
             <w:rStyle w:val="VerbatimChar"/>
@@ -5944,9 +5944,9 @@
         <w:t xml:space="preserve">&lt;INSERT ADDITIONAL INFORMATION AS APPROPRIATE&gt;</w:t>
       </w:r>
     </w:p>
-    <w:bookmarkEnd w:id="48"/>
-    <w:bookmarkEnd w:id="49"/>
-    <w:bookmarkStart w:id="52" w:name="removal-of-unsupported-operating-systems"/>
+    <w:bookmarkEnd w:id="51"/>
+    <w:bookmarkEnd w:id="52"/>
+    <w:bookmarkStart w:id="55" w:name="removal-of-unsupported-operating-systems"/>
     <w:p>
       <w:pPr>
         <w:pStyle w:val="Heading3"/>
@@ -6025,7 +6025,7 @@
         </w:tc>
       </w:tr>
     </w:tbl>
-    <w:bookmarkStart w:id="50" w:name="windows-endpoints-5"/>
+    <w:bookmarkStart w:id="53" w:name="windows-endpoints-5"/>
     <w:p>
       <w:pPr>
         <w:pStyle w:val="Heading4"/>
@@ -6044,7 +6044,7 @@
       <w:r>
         <w:t xml:space="preserve"> </w:t>
       </w:r>
-      <w:hyperlink r:id="rId30">
+      <w:hyperlink r:id="rId33">
         <w:r>
           <w:rPr>
             <w:rStyle w:val="VerbatimChar"/>
@@ -6094,8 +6094,8 @@
         <w:t xml:space="preserve">&lt;INSERT ADDITIONAL INFORMATION AS APPROPRIATE&gt;</w:t>
       </w:r>
     </w:p>
-    <w:bookmarkEnd w:id="50"/>
-    <w:bookmarkStart w:id="51" w:name="hybrid-servers-5"/>
+    <w:bookmarkEnd w:id="53"/>
+    <w:bookmarkStart w:id="54" w:name="hybrid-servers-5"/>
     <w:p>
       <w:pPr>
         <w:pStyle w:val="Heading4"/>
@@ -6114,7 +6114,7 @@
       <w:r>
         <w:t xml:space="preserve"> </w:t>
       </w:r>
-      <w:hyperlink r:id="rId30">
+      <w:hyperlink r:id="rId33">
         <w:r>
           <w:rPr>
             <w:rStyle w:val="VerbatimChar"/>
@@ -6169,11 +6169,11 @@
         <w:br w:type="page"/>
       </w:r>
     </w:p>
-    <w:bookmarkEnd w:id="51"/>
-    <w:bookmarkEnd w:id="52"/>
-    <w:bookmarkEnd w:id="53"/>
     <w:bookmarkEnd w:id="54"/>
-    <w:bookmarkStart w:id="63" w:name="X1ad53bb6944c84ef9e445ea1134c4f497106c9a"/>
+    <w:bookmarkEnd w:id="55"/>
+    <w:bookmarkEnd w:id="56"/>
+    <w:bookmarkEnd w:id="57"/>
+    <w:bookmarkStart w:id="66" w:name="X1ad53bb6944c84ef9e445ea1134c4f497106c9a"/>
     <w:p>
       <w:pPr>
         <w:pStyle w:val="Heading1"/>
@@ -6322,7 +6322,7 @@
             <w:r>
               <w:t xml:space="preserve"> </w:t>
             </w:r>
-            <w:hyperlink r:id="rId55">
+            <w:hyperlink r:id="rId58">
               <w:r>
                 <w:rPr>
                   <w:rStyle w:val="Hyperlink"/>
@@ -6353,7 +6353,7 @@
             <w:r>
               <w:t xml:space="preserve"> </w:t>
             </w:r>
-            <w:hyperlink r:id="rId22">
+            <w:hyperlink r:id="rId25">
               <w:r>
                 <w:rPr>
                   <w:rStyle w:val="Hyperlink"/>
@@ -6399,7 +6399,7 @@
         </w:tc>
       </w:tr>
     </w:tbl>
-    <w:bookmarkStart w:id="56" w:name="applicability-2"/>
+    <w:bookmarkStart w:id="59" w:name="applicability-2"/>
     <w:p>
       <w:pPr>
         <w:pStyle w:val="Heading2"/>
@@ -6489,8 +6489,8 @@
         <w:t xml:space="preserve">&lt;INSERT ADDITIONAL INFORMATION AS APPROPRIATE&gt;</w:t>
       </w:r>
     </w:p>
-    <w:bookmarkEnd w:id="56"/>
-    <w:bookmarkStart w:id="57" w:name="maturity-level-2"/>
+    <w:bookmarkEnd w:id="59"/>
+    <w:bookmarkStart w:id="60" w:name="maturity-level-2"/>
     <w:p>
       <w:pPr>
         <w:pStyle w:val="Heading2"/>
@@ -6631,8 +6631,8 @@
         </w:tc>
       </w:tr>
     </w:tbl>
-    <w:bookmarkEnd w:id="57"/>
-    <w:bookmarkStart w:id="62" w:name="implementation-2"/>
+    <w:bookmarkEnd w:id="60"/>
+    <w:bookmarkStart w:id="65" w:name="implementation-2"/>
     <w:p>
       <w:pPr>
         <w:pStyle w:val="Heading2"/>
@@ -6641,7 +6641,7 @@
         <w:t xml:space="preserve">Implementation</w:t>
       </w:r>
     </w:p>
-    <w:bookmarkStart w:id="59" w:name="authentication-methods-used"/>
+    <w:bookmarkStart w:id="62" w:name="authentication-methods-used"/>
     <w:p>
       <w:pPr>
         <w:pStyle w:val="Heading3"/>
@@ -7728,7 +7728,7 @@
             <w:r>
               <w:t xml:space="preserve"> </w:t>
             </w:r>
-            <w:hyperlink r:id="rId58">
+            <w:hyperlink r:id="rId61">
               <w:r>
                 <w:rPr>
                   <w:rStyle w:val="Hyperlink"/>
@@ -8002,8 +8002,8 @@
         <w:t xml:space="preserve">&lt;INSERT ADDITIONAL INFORMATION AS APPROPRIATE&gt;</w:t>
       </w:r>
     </w:p>
-    <w:bookmarkEnd w:id="59"/>
-    <w:bookmarkStart w:id="60" w:name="logging"/>
+    <w:bookmarkEnd w:id="62"/>
+    <w:bookmarkStart w:id="63" w:name="logging"/>
     <w:p>
       <w:pPr>
         <w:pStyle w:val="Heading3"/>
@@ -8850,8 +8850,8 @@
         <w:t xml:space="preserve">&lt;INSERT ADDITIONAL INFORMATION AS APPROPRIATE&gt;</w:t>
       </w:r>
     </w:p>
-    <w:bookmarkEnd w:id="60"/>
-    <w:bookmarkStart w:id="61" w:name="monitoring-and-response"/>
+    <w:bookmarkEnd w:id="63"/>
+    <w:bookmarkStart w:id="64" w:name="monitoring-and-response"/>
     <w:p>
       <w:pPr>
         <w:pStyle w:val="Heading3"/>
@@ -9615,7 +9615,7 @@
       <w:r>
         <w:t xml:space="preserve"> </w:t>
       </w:r>
-      <w:hyperlink r:id="rId30">
+      <w:hyperlink r:id="rId33">
         <w:r>
           <w:rPr>
             <w:rStyle w:val="Hyperlink"/>
@@ -9632,7 +9632,7 @@
       <w:r>
         <w:t xml:space="preserve"> </w:t>
       </w:r>
-      <w:hyperlink r:id="rId30">
+      <w:hyperlink r:id="rId33">
         <w:r>
           <w:rPr>
             <w:rStyle w:val="Hyperlink"/>
@@ -9678,10 +9678,10 @@
         <w:br w:type="page"/>
       </w:r>
     </w:p>
-    <w:bookmarkEnd w:id="61"/>
-    <w:bookmarkEnd w:id="62"/>
-    <w:bookmarkEnd w:id="63"/>
-    <w:bookmarkStart w:id="77" w:name="Xe99fea70a3e68505ccf2c1001950c48964c1483"/>
+    <w:bookmarkEnd w:id="64"/>
+    <w:bookmarkEnd w:id="65"/>
+    <w:bookmarkEnd w:id="66"/>
+    <w:bookmarkStart w:id="80" w:name="Xe99fea70a3e68505ccf2c1001950c48964c1483"/>
     <w:p>
       <w:pPr>
         <w:pStyle w:val="Heading1"/>
@@ -9830,7 +9830,7 @@
             <w:r>
               <w:t xml:space="preserve"> </w:t>
             </w:r>
-            <w:hyperlink r:id="rId21">
+            <w:hyperlink r:id="rId24">
               <w:r>
                 <w:rPr>
                   <w:rStyle w:val="Hyperlink"/>
@@ -9861,7 +9861,7 @@
             <w:r>
               <w:t xml:space="preserve"> </w:t>
             </w:r>
-            <w:hyperlink r:id="rId22">
+            <w:hyperlink r:id="rId25">
               <w:r>
                 <w:rPr>
                   <w:rStyle w:val="Hyperlink"/>
@@ -9907,7 +9907,7 @@
         </w:tc>
       </w:tr>
     </w:tbl>
-    <w:bookmarkStart w:id="64" w:name="applicability-3"/>
+    <w:bookmarkStart w:id="67" w:name="applicability-3"/>
     <w:p>
       <w:pPr>
         <w:pStyle w:val="Heading2"/>
@@ -9936,8 +9936,8 @@
         <w:t xml:space="preserve">.</w:t>
       </w:r>
     </w:p>
-    <w:bookmarkEnd w:id="64"/>
-    <w:bookmarkStart w:id="65" w:name="maturity-level-3"/>
+    <w:bookmarkEnd w:id="67"/>
+    <w:bookmarkStart w:id="68" w:name="maturity-level-3"/>
     <w:p>
       <w:pPr>
         <w:pStyle w:val="Heading2"/>
@@ -10078,8 +10078,8 @@
         </w:tc>
       </w:tr>
     </w:tbl>
-    <w:bookmarkEnd w:id="65"/>
-    <w:bookmarkStart w:id="76" w:name="implementation-3"/>
+    <w:bookmarkEnd w:id="68"/>
+    <w:bookmarkStart w:id="79" w:name="implementation-3"/>
     <w:p>
       <w:pPr>
         <w:pStyle w:val="Heading2"/>
@@ -10088,7 +10088,7 @@
         <w:t xml:space="preserve">Implementation</w:t>
       </w:r>
     </w:p>
-    <w:bookmarkStart w:id="66" w:name="privileged-access-requests"/>
+    <w:bookmarkStart w:id="69" w:name="privileged-access-requests"/>
     <w:p>
       <w:pPr>
         <w:pStyle w:val="Heading3"/>
@@ -10635,8 +10635,8 @@
         <w:t xml:space="preserve">&lt;DETAIL PROCESSES FOR PRIVILEGED ACCESS REQUESTS AS APPROPRIATE&gt;</w:t>
       </w:r>
     </w:p>
-    <w:bookmarkEnd w:id="66"/>
-    <w:bookmarkStart w:id="69" w:name="operating-environments"/>
+    <w:bookmarkEnd w:id="69"/>
+    <w:bookmarkStart w:id="72" w:name="operating-environments"/>
     <w:p>
       <w:pPr>
         <w:pStyle w:val="Heading3"/>
@@ -11146,7 +11146,7 @@
         </w:tc>
       </w:tr>
     </w:tbl>
-    <w:bookmarkStart w:id="67" w:name="unprivileged-operating-environment"/>
+    <w:bookmarkStart w:id="70" w:name="unprivileged-operating-environment"/>
     <w:p>
       <w:pPr>
         <w:pStyle w:val="Heading4"/>
@@ -11183,8 +11183,8 @@
         <w:t xml:space="preserve">&lt;INSERT ADDITIONAL INFORMATION AS APPROPRIATE&gt;</w:t>
       </w:r>
     </w:p>
-    <w:bookmarkEnd w:id="67"/>
-    <w:bookmarkStart w:id="68" w:name="privileged-operating-environment"/>
+    <w:bookmarkEnd w:id="70"/>
+    <w:bookmarkStart w:id="71" w:name="privileged-operating-environment"/>
     <w:p>
       <w:pPr>
         <w:pStyle w:val="Heading4"/>
@@ -11229,9 +11229,9 @@
         <w:t xml:space="preserve">&lt;INSERT ADDITIONAL INFORMATION AS APPROPRIATE&gt;</w:t>
       </w:r>
     </w:p>
-    <w:bookmarkEnd w:id="68"/>
-    <w:bookmarkEnd w:id="69"/>
-    <w:bookmarkStart w:id="70" w:name="privileged-access"/>
+    <w:bookmarkEnd w:id="71"/>
+    <w:bookmarkEnd w:id="72"/>
+    <w:bookmarkStart w:id="73" w:name="privileged-access"/>
     <w:p>
       <w:pPr>
         <w:pStyle w:val="Heading3"/>
@@ -11862,8 +11862,8 @@
         <w:t xml:space="preserve">&lt;INSERT ADDITIONAL INFORMATION AS APPROPRIATE&gt;</w:t>
       </w:r>
     </w:p>
-    <w:bookmarkEnd w:id="70"/>
-    <w:bookmarkStart w:id="72" w:name="management-of-credentials"/>
+    <w:bookmarkEnd w:id="73"/>
+    <w:bookmarkStart w:id="75" w:name="management-of-credentials"/>
     <w:p>
       <w:pPr>
         <w:pStyle w:val="Heading3"/>
@@ -12006,7 +12006,7 @@
       <w:r>
         <w:t xml:space="preserve"> </w:t>
       </w:r>
-      <w:hyperlink r:id="rId71">
+      <w:hyperlink r:id="rId74">
         <w:r>
           <w:rPr>
             <w:rStyle w:val="Hyperlink"/>
@@ -12029,8 +12029,8 @@
         <w:t xml:space="preserve">&lt;INSERT ADDITIONAL INFORMATION AS APPROPRIATE&gt;</w:t>
       </w:r>
     </w:p>
-    <w:bookmarkEnd w:id="72"/>
-    <w:bookmarkStart w:id="73" w:name="protecting-credentials"/>
+    <w:bookmarkEnd w:id="75"/>
+    <w:bookmarkStart w:id="76" w:name="protecting-credentials"/>
     <w:p>
       <w:pPr>
         <w:pStyle w:val="Heading3"/>
@@ -12363,8 +12363,8 @@
         <w:t xml:space="preserve">&lt;INSERT ADDITIONAL INFORMATION AS APPROPRIATE&gt;</w:t>
       </w:r>
     </w:p>
-    <w:bookmarkEnd w:id="73"/>
-    <w:bookmarkStart w:id="74" w:name="logging-1"/>
+    <w:bookmarkEnd w:id="76"/>
+    <w:bookmarkStart w:id="77" w:name="logging-1"/>
     <w:p>
       <w:pPr>
         <w:pStyle w:val="Heading3"/>
@@ -12973,8 +12973,8 @@
         <w:t xml:space="preserve">&lt;INSERT ADDITIONAL INFORMATION AS APPROPRIATE&gt;</w:t>
       </w:r>
     </w:p>
-    <w:bookmarkEnd w:id="74"/>
-    <w:bookmarkStart w:id="75" w:name="monitoring-and-response-1"/>
+    <w:bookmarkEnd w:id="77"/>
+    <w:bookmarkStart w:id="78" w:name="monitoring-and-response-1"/>
     <w:p>
       <w:pPr>
         <w:pStyle w:val="Heading3"/>
@@ -13649,7 +13649,7 @@
       <w:r>
         <w:t xml:space="preserve"> </w:t>
       </w:r>
-      <w:hyperlink r:id="rId30">
+      <w:hyperlink r:id="rId33">
         <w:r>
           <w:rPr>
             <w:rStyle w:val="Hyperlink"/>
@@ -13663,7 +13663,7 @@
       <w:r>
         <w:t xml:space="preserve"> </w:t>
       </w:r>
-      <w:hyperlink r:id="rId30">
+      <w:hyperlink r:id="rId33">
         <w:r>
           <w:rPr>
             <w:rStyle w:val="Hyperlink"/>
@@ -13709,10 +13709,10 @@
         <w:br w:type="page"/>
       </w:r>
     </w:p>
-    <w:bookmarkEnd w:id="75"/>
-    <w:bookmarkEnd w:id="76"/>
-    <w:bookmarkEnd w:id="77"/>
-    <w:bookmarkStart w:id="88" w:name="X8af4a57bdeddd6be86ba222951d4fc4e9597958"/>
+    <w:bookmarkEnd w:id="78"/>
+    <w:bookmarkEnd w:id="79"/>
+    <w:bookmarkEnd w:id="80"/>
+    <w:bookmarkStart w:id="91" w:name="X8af4a57bdeddd6be86ba222951d4fc4e9597958"/>
     <w:p>
       <w:pPr>
         <w:pStyle w:val="Heading1"/>
@@ -13861,7 +13861,7 @@
             <w:r>
               <w:t xml:space="preserve"> </w:t>
             </w:r>
-            <w:hyperlink r:id="rId21">
+            <w:hyperlink r:id="rId24">
               <w:r>
                 <w:rPr>
                   <w:rStyle w:val="Hyperlink"/>
@@ -13892,7 +13892,7 @@
             <w:r>
               <w:t xml:space="preserve"> </w:t>
             </w:r>
-            <w:hyperlink r:id="rId22">
+            <w:hyperlink r:id="rId25">
               <w:r>
                 <w:rPr>
                   <w:rStyle w:val="Hyperlink"/>
@@ -13938,7 +13938,7 @@
         </w:tc>
       </w:tr>
     </w:tbl>
-    <w:bookmarkStart w:id="78" w:name="applicability-4"/>
+    <w:bookmarkStart w:id="81" w:name="applicability-4"/>
     <w:p>
       <w:pPr>
         <w:pStyle w:val="Heading2"/>
@@ -14008,8 +14008,8 @@
         <w:t xml:space="preserve">&lt;INSERT ADDITIONAL INFORMATION AS APPROPRIATE&gt;</w:t>
       </w:r>
     </w:p>
-    <w:bookmarkEnd w:id="78"/>
-    <w:bookmarkStart w:id="79" w:name="maturity-level-4"/>
+    <w:bookmarkEnd w:id="81"/>
+    <w:bookmarkStart w:id="82" w:name="maturity-level-4"/>
     <w:p>
       <w:pPr>
         <w:pStyle w:val="Heading2"/>
@@ -14150,8 +14150,8 @@
         </w:tc>
       </w:tr>
     </w:tbl>
-    <w:bookmarkEnd w:id="79"/>
-    <w:bookmarkStart w:id="87" w:name="implementation-4"/>
+    <w:bookmarkEnd w:id="82"/>
+    <w:bookmarkStart w:id="90" w:name="implementation-4"/>
     <w:p>
       <w:pPr>
         <w:pStyle w:val="Heading2"/>
@@ -14160,7 +14160,7 @@
         <w:t xml:space="preserve">Implementation</w:t>
       </w:r>
     </w:p>
-    <w:bookmarkStart w:id="82" w:name="windows-endpoints-6"/>
+    <w:bookmarkStart w:id="85" w:name="windows-endpoints-6"/>
     <w:p>
       <w:pPr>
         <w:pStyle w:val="Heading3"/>
@@ -15316,7 +15316,7 @@
       <w:r>
         <w:t xml:space="preserve"> </w:t>
       </w:r>
-      <w:hyperlink r:id="rId80">
+      <w:hyperlink r:id="rId83">
         <w:r>
           <w:rPr>
             <w:rStyle w:val="Hyperlink"/>
@@ -15333,7 +15333,7 @@
       <w:r>
         <w:t xml:space="preserve"> </w:t>
       </w:r>
-      <w:hyperlink r:id="rId81">
+      <w:hyperlink r:id="rId84">
         <w:r>
           <w:rPr>
             <w:rStyle w:val="Hyperlink"/>
@@ -15397,7 +15397,7 @@
       <w:r>
         <w:t xml:space="preserve"> </w:t>
       </w:r>
-      <w:hyperlink r:id="rId30">
+      <w:hyperlink r:id="rId33">
         <w:r>
           <w:rPr>
             <w:rStyle w:val="Hyperlink"/>
@@ -15435,8 +15435,8 @@
         <w:t xml:space="preserve">&lt;INSERT ADDITIONAL INFORMATION AS APPROPRIATE&gt;</w:t>
       </w:r>
     </w:p>
-    <w:bookmarkEnd w:id="82"/>
-    <w:bookmarkStart w:id="83" w:name="internet-facing-servers"/>
+    <w:bookmarkEnd w:id="85"/>
+    <w:bookmarkStart w:id="86" w:name="internet-facing-servers"/>
     <w:p>
       <w:pPr>
         <w:pStyle w:val="Heading3"/>
@@ -16490,8 +16490,8 @@
         <w:t xml:space="preserve">&lt;INSERT ADDITIONAL INFORMATION AS APPROPRIATE&gt;</w:t>
       </w:r>
     </w:p>
-    <w:bookmarkEnd w:id="83"/>
-    <w:bookmarkStart w:id="84" w:name="non-internet-facing-servers"/>
+    <w:bookmarkEnd w:id="86"/>
+    <w:bookmarkStart w:id="87" w:name="non-internet-facing-servers"/>
     <w:p>
       <w:pPr>
         <w:pStyle w:val="Heading3"/>
@@ -17545,8 +17545,8 @@
         <w:t xml:space="preserve">&lt;INSERT ADDITIONAL INFORMATION AS APPROPRIATE&gt;</w:t>
       </w:r>
     </w:p>
-    <w:bookmarkEnd w:id="84"/>
-    <w:bookmarkStart w:id="85" w:name="logging-2"/>
+    <w:bookmarkEnd w:id="87"/>
+    <w:bookmarkStart w:id="88" w:name="logging-2"/>
     <w:p>
       <w:pPr>
         <w:pStyle w:val="Heading3"/>
@@ -18198,8 +18198,8 @@
         <w:t xml:space="preserve">&lt;INSERT ADDITIONAL INFORMATION AS APPROPRIATE&gt;</w:t>
       </w:r>
     </w:p>
-    <w:bookmarkEnd w:id="85"/>
-    <w:bookmarkStart w:id="86" w:name="monitoring-and-response-2"/>
+    <w:bookmarkEnd w:id="88"/>
+    <w:bookmarkStart w:id="89" w:name="monitoring-and-response-2"/>
     <w:p>
       <w:pPr>
         <w:pStyle w:val="Heading3"/>
@@ -18823,7 +18823,7 @@
       <w:r>
         <w:t xml:space="preserve"> </w:t>
       </w:r>
-      <w:hyperlink r:id="rId30">
+      <w:hyperlink r:id="rId33">
         <w:r>
           <w:rPr>
             <w:rStyle w:val="Hyperlink"/>
@@ -18840,7 +18840,7 @@
       <w:r>
         <w:t xml:space="preserve"> </w:t>
       </w:r>
-      <w:hyperlink r:id="rId30">
+      <w:hyperlink r:id="rId33">
         <w:r>
           <w:rPr>
             <w:rStyle w:val="Hyperlink"/>
@@ -18883,10 +18883,10 @@
         <w:br w:type="page"/>
       </w:r>
     </w:p>
-    <w:bookmarkEnd w:id="86"/>
-    <w:bookmarkEnd w:id="87"/>
-    <w:bookmarkEnd w:id="88"/>
-    <w:bookmarkStart w:id="98" w:name="X2fc826c75af19592b40f4f35cffa43a994cfb6f"/>
+    <w:bookmarkEnd w:id="89"/>
+    <w:bookmarkEnd w:id="90"/>
+    <w:bookmarkEnd w:id="91"/>
+    <w:bookmarkStart w:id="101" w:name="X2fc826c75af19592b40f4f35cffa43a994cfb6f"/>
     <w:p>
       <w:pPr>
         <w:pStyle w:val="Heading1"/>
@@ -19035,7 +19035,7 @@
             <w:r>
               <w:t xml:space="preserve"> </w:t>
             </w:r>
-            <w:hyperlink r:id="rId21">
+            <w:hyperlink r:id="rId24">
               <w:r>
                 <w:rPr>
                   <w:rStyle w:val="Hyperlink"/>
@@ -19066,7 +19066,7 @@
             <w:r>
               <w:t xml:space="preserve"> </w:t>
             </w:r>
-            <w:hyperlink r:id="rId22">
+            <w:hyperlink r:id="rId25">
               <w:r>
                 <w:rPr>
                   <w:rStyle w:val="Hyperlink"/>
@@ -19112,7 +19112,7 @@
         </w:tc>
       </w:tr>
     </w:tbl>
-    <w:bookmarkStart w:id="89" w:name="applicability-5"/>
+    <w:bookmarkStart w:id="92" w:name="applicability-5"/>
     <w:p>
       <w:pPr>
         <w:pStyle w:val="Heading2"/>
@@ -19144,8 +19144,8 @@
         <w:t xml:space="preserve">workstations and servers.</w:t>
       </w:r>
     </w:p>
-    <w:bookmarkEnd w:id="89"/>
-    <w:bookmarkStart w:id="90" w:name="maturity-level-5"/>
+    <w:bookmarkEnd w:id="92"/>
+    <w:bookmarkStart w:id="93" w:name="maturity-level-5"/>
     <w:p>
       <w:pPr>
         <w:pStyle w:val="Heading2"/>
@@ -19286,8 +19286,8 @@
         </w:tc>
       </w:tr>
     </w:tbl>
-    <w:bookmarkEnd w:id="90"/>
-    <w:bookmarkStart w:id="97" w:name="implementation-5"/>
+    <w:bookmarkEnd w:id="93"/>
+    <w:bookmarkStart w:id="100" w:name="implementation-5"/>
     <w:p>
       <w:pPr>
         <w:pStyle w:val="Heading2"/>
@@ -19577,7 +19577,7 @@
         </w:tc>
       </w:tr>
     </w:tbl>
-    <w:bookmarkStart w:id="95" w:name="windows-endpoints-7"/>
+    <w:bookmarkStart w:id="98" w:name="windows-endpoints-7"/>
     <w:p>
       <w:pPr>
         <w:pStyle w:val="Heading3"/>
@@ -19605,7 +19605,7 @@
       <w:r>
         <w:t xml:space="preserve"> </w:t>
       </w:r>
-      <w:hyperlink r:id="rId91">
+      <w:hyperlink r:id="rId94">
         <w:r>
           <w:rPr>
             <w:rStyle w:val="Hyperlink"/>
@@ -19632,7 +19632,7 @@
       <w:r>
         <w:t xml:space="preserve"> </w:t>
       </w:r>
-      <w:hyperlink r:id="rId92">
+      <w:hyperlink r:id="rId95">
         <w:r>
           <w:rPr>
             <w:rStyle w:val="Hyperlink"/>
@@ -19657,7 +19657,7 @@
       <w:r>
         <w:t xml:space="preserve"> </w:t>
       </w:r>
-      <w:hyperlink r:id="rId93">
+      <w:hyperlink r:id="rId96">
         <w:r>
           <w:rPr>
             <w:rStyle w:val="Hyperlink"/>
@@ -19676,7 +19676,7 @@
       <w:r>
         <w:t xml:space="preserve"> </w:t>
       </w:r>
-      <w:hyperlink r:id="rId94">
+      <w:hyperlink r:id="rId97">
         <w:r>
           <w:rPr>
             <w:rStyle w:val="Hyperlink"/>
@@ -19721,8 +19721,8 @@
         <w:t xml:space="preserve">&lt;INSERT ADDITIONAL INFORMATION AS APPROPRIATE&gt;</w:t>
       </w:r>
     </w:p>
-    <w:bookmarkEnd w:id="95"/>
-    <w:bookmarkStart w:id="96" w:name="hybrid-servers-6"/>
+    <w:bookmarkEnd w:id="98"/>
+    <w:bookmarkStart w:id="99" w:name="hybrid-servers-6"/>
     <w:p>
       <w:pPr>
         <w:pStyle w:val="Heading3"/>
@@ -19853,10 +19853,10 @@
         <w:br w:type="page"/>
       </w:r>
     </w:p>
-    <w:bookmarkEnd w:id="96"/>
-    <w:bookmarkEnd w:id="97"/>
-    <w:bookmarkEnd w:id="98"/>
-    <w:bookmarkStart w:id="107" w:name="Xcd5ba3547d16b57e1b929aea69233a079208883"/>
+    <w:bookmarkEnd w:id="99"/>
+    <w:bookmarkEnd w:id="100"/>
+    <w:bookmarkEnd w:id="101"/>
+    <w:bookmarkStart w:id="110" w:name="Xcd5ba3547d16b57e1b929aea69233a079208883"/>
     <w:p>
       <w:pPr>
         <w:pStyle w:val="Heading1"/>
@@ -20005,7 +20005,7 @@
             <w:r>
               <w:t xml:space="preserve"> </w:t>
             </w:r>
-            <w:hyperlink r:id="rId21">
+            <w:hyperlink r:id="rId24">
               <w:r>
                 <w:rPr>
                   <w:rStyle w:val="Hyperlink"/>
@@ -20036,7 +20036,7 @@
             <w:r>
               <w:t xml:space="preserve"> </w:t>
             </w:r>
-            <w:hyperlink r:id="rId22">
+            <w:hyperlink r:id="rId25">
               <w:r>
                 <w:rPr>
                   <w:rStyle w:val="Hyperlink"/>
@@ -20082,7 +20082,7 @@
         </w:tc>
       </w:tr>
     </w:tbl>
-    <w:bookmarkStart w:id="99" w:name="applicability-6"/>
+    <w:bookmarkStart w:id="102" w:name="applicability-6"/>
     <w:p>
       <w:pPr>
         <w:pStyle w:val="Heading2"/>
@@ -20114,8 +20114,8 @@
         <w:t xml:space="preserve">workstations and servers.</w:t>
       </w:r>
     </w:p>
-    <w:bookmarkEnd w:id="99"/>
-    <w:bookmarkStart w:id="100" w:name="maturity-level-6"/>
+    <w:bookmarkEnd w:id="102"/>
+    <w:bookmarkStart w:id="103" w:name="maturity-level-6"/>
     <w:p>
       <w:pPr>
         <w:pStyle w:val="Heading2"/>
@@ -20256,8 +20256,8 @@
         </w:tc>
       </w:tr>
     </w:tbl>
-    <w:bookmarkEnd w:id="100"/>
-    <w:bookmarkStart w:id="106" w:name="implementation-6"/>
+    <w:bookmarkEnd w:id="103"/>
+    <w:bookmarkStart w:id="109" w:name="implementation-6"/>
     <w:p>
       <w:pPr>
         <w:pStyle w:val="Heading2"/>
@@ -20266,7 +20266,7 @@
         <w:t xml:space="preserve">Implementation</w:t>
       </w:r>
     </w:p>
-    <w:bookmarkStart w:id="103" w:name="user-application-hardening"/>
+    <w:bookmarkStart w:id="106" w:name="user-application-hardening"/>
     <w:p>
       <w:pPr>
         <w:pStyle w:val="Heading3"/>
@@ -20625,7 +20625,7 @@
         </w:tc>
       </w:tr>
     </w:tbl>
-    <w:bookmarkStart w:id="101" w:name="workstations"/>
+    <w:bookmarkStart w:id="104" w:name="workstations"/>
     <w:p>
       <w:pPr>
         <w:pStyle w:val="Heading4"/>
@@ -21737,8 +21737,8 @@
         </w:tc>
       </w:tr>
     </w:tbl>
-    <w:bookmarkEnd w:id="101"/>
-    <w:bookmarkStart w:id="102" w:name="servers"/>
+    <w:bookmarkEnd w:id="104"/>
+    <w:bookmarkStart w:id="105" w:name="servers"/>
     <w:p>
       <w:pPr>
         <w:pStyle w:val="Heading4"/>
@@ -22419,9 +22419,9 @@
         </w:tc>
       </w:tr>
     </w:tbl>
-    <w:bookmarkEnd w:id="102"/>
-    <w:bookmarkEnd w:id="103"/>
-    <w:bookmarkStart w:id="104" w:name="logging-3"/>
+    <w:bookmarkEnd w:id="105"/>
+    <w:bookmarkEnd w:id="106"/>
+    <w:bookmarkStart w:id="107" w:name="logging-3"/>
     <w:p>
       <w:pPr>
         <w:pStyle w:val="Heading3"/>
@@ -23228,8 +23228,8 @@
         </w:tc>
       </w:tr>
     </w:tbl>
-    <w:bookmarkEnd w:id="104"/>
-    <w:bookmarkStart w:id="105" w:name="monitoring-and-response-3"/>
+    <w:bookmarkEnd w:id="107"/>
+    <w:bookmarkStart w:id="108" w:name="monitoring-and-response-3"/>
     <w:p>
       <w:pPr>
         <w:pStyle w:val="Heading3"/>
@@ -23951,7 +23951,7 @@
       <w:r>
         <w:t xml:space="preserve"> </w:t>
       </w:r>
-      <w:hyperlink r:id="rId30">
+      <w:hyperlink r:id="rId33">
         <w:r>
           <w:rPr>
             <w:rStyle w:val="Hyperlink"/>
@@ -23965,7 +23965,7 @@
       <w:r>
         <w:t xml:space="preserve"> </w:t>
       </w:r>
-      <w:hyperlink r:id="rId30">
+      <w:hyperlink r:id="rId33">
         <w:r>
           <w:rPr>
             <w:rStyle w:val="Hyperlink"/>
@@ -24011,10 +24011,10 @@
         <w:br w:type="page"/>
       </w:r>
     </w:p>
-    <w:bookmarkEnd w:id="105"/>
-    <w:bookmarkEnd w:id="106"/>
-    <w:bookmarkEnd w:id="107"/>
-    <w:bookmarkStart w:id="114" w:name="Xa0750c5df5979419b2e26a6c0c57d353f51edf9"/>
+    <w:bookmarkEnd w:id="108"/>
+    <w:bookmarkEnd w:id="109"/>
+    <w:bookmarkEnd w:id="110"/>
+    <w:bookmarkStart w:id="117" w:name="Xa0750c5df5979419b2e26a6c0c57d353f51edf9"/>
     <w:p>
       <w:pPr>
         <w:pStyle w:val="Heading1"/>
@@ -24163,7 +24163,7 @@
             <w:r>
               <w:t xml:space="preserve"> </w:t>
             </w:r>
-            <w:hyperlink r:id="rId21">
+            <w:hyperlink r:id="rId24">
               <w:r>
                 <w:rPr>
                   <w:rStyle w:val="Hyperlink"/>
@@ -24194,7 +24194,7 @@
             <w:r>
               <w:t xml:space="preserve"> </w:t>
             </w:r>
-            <w:hyperlink r:id="rId22">
+            <w:hyperlink r:id="rId25">
               <w:r>
                 <w:rPr>
                   <w:rStyle w:val="Hyperlink"/>
@@ -24240,7 +24240,7 @@
         </w:tc>
       </w:tr>
     </w:tbl>
-    <w:bookmarkStart w:id="108" w:name="applicability-7"/>
+    <w:bookmarkStart w:id="111" w:name="applicability-7"/>
     <w:p>
       <w:pPr>
         <w:pStyle w:val="Heading2"/>
@@ -24298,8 +24298,8 @@
         <w:t xml:space="preserve">&lt;INSERT ADDITIONAL INFORMATION AS APPROPRIATE&gt;</w:t>
       </w:r>
     </w:p>
-    <w:bookmarkEnd w:id="108"/>
-    <w:bookmarkStart w:id="109" w:name="maturity-level-7"/>
+    <w:bookmarkEnd w:id="111"/>
+    <w:bookmarkStart w:id="112" w:name="maturity-level-7"/>
     <w:p>
       <w:pPr>
         <w:pStyle w:val="Heading2"/>
@@ -24440,8 +24440,8 @@
         </w:tc>
       </w:tr>
     </w:tbl>
-    <w:bookmarkEnd w:id="109"/>
-    <w:bookmarkStart w:id="113" w:name="implementation-7"/>
+    <w:bookmarkEnd w:id="112"/>
+    <w:bookmarkStart w:id="116" w:name="implementation-7"/>
     <w:p>
       <w:pPr>
         <w:pStyle w:val="Heading2"/>
@@ -24450,7 +24450,7 @@
         <w:t xml:space="preserve">Implementation</w:t>
       </w:r>
     </w:p>
-    <w:bookmarkStart w:id="110" w:name="performing-backups"/>
+    <w:bookmarkStart w:id="113" w:name="performing-backups"/>
     <w:p>
       <w:pPr>
         <w:pStyle w:val="Heading3"/>
@@ -24626,8 +24626,8 @@
         <w:t xml:space="preserve">&lt;DESCRIBE APPROACH TO PERFORMING BACKUPS AS APPROPRIATE&gt;</w:t>
       </w:r>
     </w:p>
-    <w:bookmarkEnd w:id="110"/>
-    <w:bookmarkStart w:id="111" w:name="restoring-from-backups"/>
+    <w:bookmarkEnd w:id="113"/>
+    <w:bookmarkStart w:id="114" w:name="restoring-from-backups"/>
     <w:p>
       <w:pPr>
         <w:pStyle w:val="Heading3"/>
@@ -24762,8 +24762,8 @@
         <w:t xml:space="preserve">&lt;DESCRIBE APPROACH TO RESTORING FROM BACKUPS AS APPROPRIATE&gt;</w:t>
       </w:r>
     </w:p>
-    <w:bookmarkEnd w:id="111"/>
-    <w:bookmarkStart w:id="112" w:name="hardening-backups"/>
+    <w:bookmarkEnd w:id="114"/>
+    <w:bookmarkStart w:id="115" w:name="hardening-backups"/>
     <w:p>
       <w:pPr>
         <w:pStyle w:val="Heading3"/>
@@ -25485,13 +25485,13 @@
         <w:t xml:space="preserve">&lt;DESCRIBE APPROACH TO HARDENING BACKUPS AS APPROPRIATE&gt;</w:t>
       </w:r>
     </w:p>
-    <w:bookmarkEnd w:id="112"/>
-    <w:bookmarkEnd w:id="113"/>
-    <w:bookmarkEnd w:id="114"/>
+    <w:bookmarkEnd w:id="115"/>
+    <w:bookmarkEnd w:id="116"/>
+    <w:bookmarkEnd w:id="117"/>
     <w:sectPr>
-      <w:headerReference r:id="rId9" w:type="default"/>
-      <w:footerReference r:id="rId10" w:type="default"/>
-      <w:footerReference r:id="rId11" w:type="first"/>
+      <w:headerReference r:id="rId12" w:type="default"/>
+      <w:footerReference r:id="rId13" w:type="default"/>
+      <w:footerReference r:id="rId14" w:type="first"/>
       <w:pgSz w:code="9" w:h="16838" w:w="11906"/>
       <w:pgMar w:bottom="1134" w:footer="720" w:gutter="0" w:header="720" w:left="1134" w:right="1134" w:top="1134"/>
       <w:pgNumType w:start="1"/>

</xml_diff>